<commit_message>
Keep tailored resumes to one page
Measured in Word: the base resume already spilled one line onto page 2,
and a tailored one with a max-length summary pushed all of EDUCATION over.

- resume_base.docx: 0.5"/0.6" margins (was 0.75"), drop empty spacer
  paragraphs, right-tab dates moved to the new text width
- Summary prompt asks for 50-70 words (was 90-120); hard cap of 75 words,
  trimmed at a sentence boundary, on every path (Groq/Gemini/fallback)
- At most 6 JD skills added (was 12); inserted skill lines copy the full
  paragraph formatting, not just the style

Worst case (75-word summary + longer skill lines + 2 new categories)
still fits with ~35pt to spare; nothing outside Summary/Skills changes.

Co-Authored-By: Claude Opus 5.5 <noreply@anthropic.com>
</commit_message>
<xml_diff>
--- a/resume_base.docx
+++ b/resume_base.docx
@@ -103,11 +103,6 @@
     </w:p>
     <w:p>
       <w:pPr>
-        <w:spacing w:before="40" w:after="0"/>
-      </w:pPr>
-    </w:p>
-    <w:p>
-      <w:pPr>
         <w:spacing w:before="40" w:after="40"/>
       </w:pPr>
       <w:r>
@@ -255,11 +250,6 @@
         </w:rPr>
         <w:t xml:space="preserve">Data Structures &amp; Algorithms (DSA), OOP, SOLID Principles, DBMS, Operating Systems, Computer Networks</w:t>
       </w:r>
-    </w:p>
-    <w:p>
-      <w:pPr>
-        <w:spacing w:before="40" w:after="0"/>
-      </w:pPr>
     </w:p>
     <w:p>
       <w:pPr>
@@ -283,7 +273,7 @@
     <w:p>
       <w:pPr>
         <w:tabs>
-          <w:tab w:val="right" w:pos="9360"/>
+          <w:tab w:val="right" w:pos="10512"/>
         </w:tabs>
         <w:spacing w:before="140" w:after="30"/>
       </w:pPr>
@@ -398,11 +388,6 @@
     </w:p>
     <w:p>
       <w:pPr>
-        <w:spacing w:before="40" w:after="0"/>
-      </w:pPr>
-    </w:p>
-    <w:p>
-      <w:pPr>
         <w:pBdr>
           <w:bottom w:val="single" w:color="1F4E79" w:sz="8" w:space="2"/>
         </w:pBdr>
@@ -423,7 +408,7 @@
     <w:p>
       <w:pPr>
         <w:tabs>
-          <w:tab w:val="right" w:pos="9360"/>
+          <w:tab w:val="right" w:pos="10512"/>
         </w:tabs>
         <w:spacing w:before="140" w:after="30"/>
       </w:pPr>
@@ -498,7 +483,7 @@
     <w:p>
       <w:pPr>
         <w:tabs>
-          <w:tab w:val="right" w:pos="9360"/>
+          <w:tab w:val="right" w:pos="10512"/>
         </w:tabs>
         <w:spacing w:before="140" w:after="30"/>
       </w:pPr>
@@ -572,11 +557,6 @@
     </w:p>
     <w:p>
       <w:pPr>
-        <w:spacing w:before="40" w:after="0"/>
-      </w:pPr>
-    </w:p>
-    <w:p>
-      <w:pPr>
         <w:pBdr>
           <w:bottom w:val="single" w:color="1F4E79" w:sz="8" w:space="2"/>
         </w:pBdr>
@@ -597,7 +577,7 @@
     <w:p>
       <w:pPr>
         <w:tabs>
-          <w:tab w:val="right" w:pos="9360"/>
+          <w:tab w:val="right" w:pos="10512"/>
         </w:tabs>
         <w:spacing w:before="80" w:after="40"/>
       </w:pPr>
@@ -652,7 +632,7 @@
     </w:p>
     <w:sectPr>
       <w:pgSz w:w="12240" w:h="15840" w:orient="portrait"/>
-      <w:pgMar w:top="1080" w:right="1080" w:bottom="1080" w:left="1080" w:header="708" w:footer="708" w:gutter="0"/>
+      <w:pgMar w:top="720" w:right="864" w:bottom="720" w:left="864" w:header="708" w:footer="708" w:gutter="0"/>
       <w:pgNumType/>
       <w:docGrid w:linePitch="360"/>
       <w:cols w:num="1"/>

</xml_diff>